<commit_message>
Se agrega los gráficos
</commit_message>
<xml_diff>
--- a/Investigacion/Desarrollo APIS.docx
+++ b/Investigacion/Desarrollo APIS.docx
@@ -2678,7 +2678,27 @@
                 <w:noProof/>
                 <w:lang w:eastAsia="es-CR"/>
               </w:rPr>
-              <w:t>Lenguajes o plataforma</w:t>
+              <w:t>Lenguajes o p</w:t>
+            </w:r>
+            <w:r>
+              <w:rPr>
+                <w:rStyle w:val="Hipervnculo"/>
+                <w:rFonts w:eastAsia="Times New Roman" w:cs="Times New Roman"/>
+                <w:b/>
+                <w:noProof/>
+                <w:lang w:eastAsia="es-CR"/>
+              </w:rPr>
+              <w:t>l</w:t>
+            </w:r>
+            <w:r>
+              <w:rPr>
+                <w:rStyle w:val="Hipervnculo"/>
+                <w:rFonts w:eastAsia="Times New Roman" w:cs="Times New Roman"/>
+                <w:b/>
+                <w:noProof/>
+                <w:lang w:eastAsia="es-CR"/>
+              </w:rPr>
+              <w:t>ataforma</w:t>
             </w:r>
             <w:r>
               <w:rPr>
@@ -13167,32 +13187,19 @@
         </w:rPr>
         <w:t xml:space="preserve"> Blog. </w:t>
       </w:r>
-      <w:r>
-        <w:fldChar w:fldCharType="begin"/>
-      </w:r>
-      <w:r>
-        <w:rPr>
-          <w:lang w:val="en-US"/>
-        </w:rPr>
-        <w:instrText>HYPERLINK "https://apidog.com/es/blog/best-languages-for-building-apis-2/"</w:instrText>
-      </w:r>
-      <w:r>
-        <w:fldChar w:fldCharType="separate"/>
-      </w:r>
-      <w:r>
-        <w:rPr>
-          <w:rStyle w:val="Hipervnculo"/>
-          <w:rFonts w:eastAsia="Aptos" w:cs="Times New Roman"/>
-          <w:kern w:val="2"/>
-          <w:szCs w:val="24"/>
-          <w:lang w:val="en-US"/>
-          <w14:ligatures w14:val="standardContextual"/>
-        </w:rPr>
-        <w:t>https://apidog.com/es/blog/best-languages-for-building-apis-2/</w:t>
-      </w:r>
-      <w:r>
-        <w:fldChar w:fldCharType="end"/>
-      </w:r>
+      <w:hyperlink r:id="rId15" w:history="1">
+        <w:r>
+          <w:rPr>
+            <w:rStyle w:val="Hipervnculo"/>
+            <w:rFonts w:eastAsia="Aptos" w:cs="Times New Roman"/>
+            <w:kern w:val="2"/>
+            <w:szCs w:val="24"/>
+            <w:lang w:val="en-US"/>
+            <w14:ligatures w14:val="standardContextual"/>
+          </w:rPr>
+          <w:t>https://apidog.com/es/blog/best-languages-for-building-apis-2/</w:t>
+        </w:r>
+      </w:hyperlink>
     </w:p>
     <w:p>
       <w:pPr>
@@ -13245,32 +13252,19 @@
         </w:rPr>
         <w:t xml:space="preserve">Coding Networks Blog. </w:t>
       </w:r>
-      <w:r>
-        <w:fldChar w:fldCharType="begin"/>
-      </w:r>
-      <w:r>
-        <w:rPr>
-          <w:lang w:val="en-US"/>
-        </w:rPr>
-        <w:instrText>HYPERLINK "https://codingnetworks.blog/que-es-un-api-rest-fundamentos-para-ingenieros-de-redes/"</w:instrText>
-      </w:r>
-      <w:r>
-        <w:fldChar w:fldCharType="separate"/>
-      </w:r>
-      <w:r>
-        <w:rPr>
-          <w:rStyle w:val="Hipervnculo"/>
-          <w:rFonts w:eastAsia="Aptos" w:cs="Times New Roman"/>
-          <w:kern w:val="2"/>
-          <w:szCs w:val="24"/>
-          <w:lang w:val="en-US"/>
-          <w14:ligatures w14:val="standardContextual"/>
-        </w:rPr>
-        <w:t>https://codingnetworks.blog/que-es-un-api-rest-fundamentos-para-ingenieros-de-redes/</w:t>
-      </w:r>
-      <w:r>
-        <w:fldChar w:fldCharType="end"/>
-      </w:r>
+      <w:hyperlink r:id="rId16" w:history="1">
+        <w:r>
+          <w:rPr>
+            <w:rStyle w:val="Hipervnculo"/>
+            <w:rFonts w:eastAsia="Aptos" w:cs="Times New Roman"/>
+            <w:kern w:val="2"/>
+            <w:szCs w:val="24"/>
+            <w:lang w:val="en-US"/>
+            <w14:ligatures w14:val="standardContextual"/>
+          </w:rPr>
+          <w:t>https://codingnetworks.blog/que-es-un-api-rest-fundamentos-para-ingenieros-de-redes/</w:t>
+        </w:r>
+      </w:hyperlink>
     </w:p>
     <w:p>
       <w:pPr>
@@ -13343,7 +13337,7 @@
         </w:rPr>
         <w:t xml:space="preserve">. </w:t>
       </w:r>
-      <w:hyperlink r:id="rId15" w:history="1">
+      <w:hyperlink r:id="rId17" w:history="1">
         <w:r>
           <w:rPr>
             <w:rStyle w:val="Hipervnculo"/>
@@ -13433,7 +13427,7 @@
         </w:rPr>
         <w:t xml:space="preserve">. Wikipedia, la Enciclopedia Libre. </w:t>
       </w:r>
-      <w:hyperlink r:id="rId16" w:history="1">
+      <w:hyperlink r:id="rId18" w:history="1">
         <w:r>
           <w:rPr>
             <w:rStyle w:val="Hipervnculo"/>
@@ -13498,7 +13492,7 @@
         </w:rPr>
         <w:t xml:space="preserve">. </w:t>
       </w:r>
-      <w:hyperlink r:id="rId17" w:history="1">
+      <w:hyperlink r:id="rId19" w:history="1">
         <w:r>
           <w:rPr>
             <w:rStyle w:val="Hipervnculo"/>
@@ -13599,32 +13593,19 @@
         </w:rPr>
         <w:t xml:space="preserve"> Digital Agency | Digital Marketing &amp; Web Development Agency | Jamaica. </w:t>
       </w:r>
-      <w:r>
-        <w:fldChar w:fldCharType="begin"/>
-      </w:r>
-      <w:r>
-        <w:rPr>
-          <w:lang w:val="en-US"/>
-        </w:rPr>
-        <w:instrText>HYPERLINK "https://ikonik.digital/blog/the-role-of-apis-in-web-development/"</w:instrText>
-      </w:r>
-      <w:r>
-        <w:fldChar w:fldCharType="separate"/>
-      </w:r>
-      <w:r>
-        <w:rPr>
-          <w:rStyle w:val="Hipervnculo"/>
-          <w:rFonts w:eastAsia="Aptos" w:cs="Times New Roman"/>
-          <w:kern w:val="2"/>
-          <w:szCs w:val="24"/>
-          <w:lang w:val="en-US"/>
-          <w14:ligatures w14:val="standardContextual"/>
-        </w:rPr>
-        <w:t>https://ikonik.digital/blog/the-role-of-apis-in-web-development/</w:t>
-      </w:r>
-      <w:r>
-        <w:fldChar w:fldCharType="end"/>
-      </w:r>
+      <w:hyperlink r:id="rId20" w:history="1">
+        <w:r>
+          <w:rPr>
+            <w:rStyle w:val="Hipervnculo"/>
+            <w:rFonts w:eastAsia="Aptos" w:cs="Times New Roman"/>
+            <w:kern w:val="2"/>
+            <w:szCs w:val="24"/>
+            <w:lang w:val="en-US"/>
+            <w14:ligatures w14:val="standardContextual"/>
+          </w:rPr>
+          <w:t>https://ikonik.digital/blog/the-role-of-apis-in-web-development/</w:t>
+        </w:r>
+      </w:hyperlink>
     </w:p>
     <w:p>
       <w:pPr>
@@ -13709,7 +13690,7 @@
         </w:rPr>
         <w:t xml:space="preserve">. </w:t>
       </w:r>
-      <w:hyperlink r:id="rId18" w:history="1">
+      <w:hyperlink r:id="rId21" w:history="1">
         <w:r>
           <w:rPr>
             <w:rStyle w:val="Hipervnculo"/>
@@ -13792,7 +13773,7 @@
         </w:rPr>
         <w:t xml:space="preserve"> </w:t>
       </w:r>
-      <w:hyperlink r:id="rId19" w:history="1">
+      <w:hyperlink r:id="rId22" w:history="1">
         <w:r>
           <w:rPr>
             <w:rStyle w:val="Hipervnculo"/>
@@ -13814,7 +13795,7 @@
           <w:lang w:val="en-US"/>
         </w:rPr>
       </w:pPr>
-      <w:hyperlink r:id="rId20">
+      <w:hyperlink r:id="rId23">
         <w:r>
           <w:rPr>
             <w:rFonts w:eastAsia="Aptos" w:cs="Times New Roman"/>
@@ -13841,7 +13822,7 @@
           <w14:ligatures w14:val="standardContextual"/>
         </w:rPr>
       </w:pPr>
-      <w:hyperlink r:id="rId21" w:history="1">
+      <w:hyperlink r:id="rId24" w:history="1">
         <w:r>
           <w:rPr>
             <w:rStyle w:val="Hipervnculo"/>

</xml_diff>